<commit_message>
national space policies +EU treaty
</commit_message>
<xml_diff>
--- a/01_POLICY/ESA/Index _01Policy_ESA.docx
+++ b/01_POLICY/ESA/Index _01Policy_ESA.docx
@@ -50,7 +50,15 @@
     </w:p>
     <w:p>
       <w:r>
-        <w:t>ESA/ADMIN/IPOL-WORK(2019)1 Paris, 19 June 2019 (Original: English) Distribution: all staff ESA unclassified – “Releasable to the Public” POLICY ON FACILITATION AND MEDIATION AT ESA</w:t>
+        <w:t>ESA/ADMIN/IPOL-</w:t>
+      </w:r>
+      <w:proofErr w:type="gramStart"/>
+      <w:r>
+        <w:t>WORK(</w:t>
+      </w:r>
+      <w:proofErr w:type="gramEnd"/>
+      <w:r>
+        <w:t>2019)1 Paris, 19 June 2019 (Original: English) Distribution: all staff ESA unclassified – “Releasable to the Public” POLICY ON FACILITATION AND MEDIATION AT ESA</w:t>
       </w:r>
     </w:p>
     <w:p>
@@ -65,12 +73,28 @@
     </w:p>
     <w:p>
       <w:r>
-        <w:t>ESA/ADMIN/IPOL-LEGI(2021)1 Director General’s Office Att.: Annex _______ Paris, 4 May 2021 (Original: English) Distribution: all staff ESA unclassified – “Releasable to the Public” Policy on the Prevention, Detection and Investigation of Fraud</w:t>
-      </w:r>
-    </w:p>
-    <w:p>
-      <w:r>
-        <w:t>ESA/ADMIN/IPOL-WORK(2023)1 Att.: Annex Paris, 1st February 2023 (Original: English) Distribution: all staff ESA unclassified – “Releasable to the Public” Policy on Reporting Unwanted Conduct and Investigating Harassment at ESA</w:t>
+        <w:t>ESA/ADMIN/IPOL-</w:t>
+      </w:r>
+      <w:proofErr w:type="gramStart"/>
+      <w:r>
+        <w:t>LEGI(</w:t>
+      </w:r>
+      <w:proofErr w:type="gramEnd"/>
+      <w:r>
+        <w:t>2021)1 Director General’s Office Att.: Annex _______ Paris, 4 May 2021 (Original: English) Distribution: all staff ESA unclassified – “Releasable to the Public” Policy on the Prevention, Detection and Investigation of Fraud</w:t>
+      </w:r>
+    </w:p>
+    <w:p>
+      <w:r>
+        <w:t>ESA/ADMIN/IPOL-</w:t>
+      </w:r>
+      <w:proofErr w:type="gramStart"/>
+      <w:r>
+        <w:t>WORK(</w:t>
+      </w:r>
+      <w:proofErr w:type="gramEnd"/>
+      <w:r>
+        <w:t>2023)1 Att.: Annex Paris, 1st February 2023 (Original: English) Distribution: all staff ESA unclassified – “Releasable to the Public” Policy on Reporting Unwanted Conduct and Investigating Harassment at ESA</w:t>
       </w:r>
     </w:p>
     <w:p>
@@ -83,8 +107,13 @@
     </w:p>
     <w:p>
       <w:r>
-        <w:t>2024/2920 Notice concerning the entry into force of the Agreement between the European Union and the European Space Agency on the security and exchange of classified informatio</w:t>
-      </w:r>
+        <w:t xml:space="preserve">2024/2920 Notice concerning the entry into force of the Agreement between the European Union and the European Space Agency on the security and exchange of classified </w:t>
+      </w:r>
+      <w:proofErr w:type="spellStart"/>
+      <w:r>
+        <w:t>informatio</w:t>
+      </w:r>
+      <w:proofErr w:type="spellEnd"/>
     </w:p>
     <w:p/>
     <w:p/>
@@ -95,12 +124,28 @@
     </w:p>
     <w:p>
       <w:r>
-        <w:t>ESA/REG/002,REV.4 Paris, 05 July 2024 (Original: English) REGULATIONS OF THE EUROPEAN SPACE AGENCY General Clauses and Conditions for ESA Contracts</w:t>
-      </w:r>
-    </w:p>
-    <w:p>
-      <w:r>
-        <w:t>ESA/REG/001,REV.6 Paris, 04 November 2024 (Original: English) REGULATIONS OF THE EUROPEAN SPACE AGENCY ESA Contracting Regulations and related Implementing Instructions</w:t>
+        <w:t>ESA/REG/</w:t>
+      </w:r>
+      <w:proofErr w:type="gramStart"/>
+      <w:r>
+        <w:t>002,REV.</w:t>
+      </w:r>
+      <w:proofErr w:type="gramEnd"/>
+      <w:r>
+        <w:t>4 Paris, 05 July 2024 (Original: English) REGULATIONS OF THE EUROPEAN SPACE AGENCY General Clauses and Conditions for ESA Contracts</w:t>
+      </w:r>
+    </w:p>
+    <w:p>
+      <w:r>
+        <w:t>ESA/REG/</w:t>
+      </w:r>
+      <w:proofErr w:type="gramStart"/>
+      <w:r>
+        <w:t>001,REV.</w:t>
+      </w:r>
+      <w:proofErr w:type="gramEnd"/>
+      <w:r>
+        <w:t>6 Paris, 04 November 2024 (Original: English) REGULATIONS OF THE EUROPEAN SPACE AGENCY ESA Contracting Regulations and related Implementing Instructions</w:t>
       </w:r>
     </w:p>
     <w:p>
@@ -108,7 +153,16 @@
         <w:t>ESA/REG/007, rev.14 Paris, January 2026 (Original: English) REGULATIONS OF THE EUROPEAN SPACE AGENCY Staff Regulations and Rules</w:t>
       </w:r>
     </w:p>
-    <w:p/>
+    <w:p>
+      <w:r>
+        <w:t>ESA_Strategy_2040_InDepth</w:t>
+      </w:r>
+    </w:p>
+    <w:p>
+      <w:r>
+        <w:t>ESA_CM2025_1_Resolution_on_Elevating_Europe_through_Space</w:t>
+      </w:r>
+    </w:p>
     <w:sectPr>
       <w:pgSz w:w="11906" w:h="16838"/>
       <w:pgMar w:top="1440" w:right="1440" w:bottom="1440" w:left="1440" w:header="720" w:footer="720" w:gutter="0"/>
@@ -722,6 +776,7 @@
   <w:style w:type="character" w:default="1" w:styleId="DefaultParagraphFont">
     <w:name w:val="Default Paragraph Font"/>
     <w:uiPriority w:val="1"/>
+    <w:semiHidden/>
     <w:unhideWhenUsed/>
   </w:style>
   <w:style w:type="table" w:default="1" w:styleId="TableNormal">

</xml_diff>

<commit_message>
Esa and Euspa procurement data
</commit_message>
<xml_diff>
--- a/01_POLICY/ESA/Index _01Policy_ESA.docx
+++ b/01_POLICY/ESA/Index _01Policy_ESA.docx
@@ -1,6 +1,6 @@
 
 <file path=word/document.xml><?xml version="1.0" encoding="utf-8"?>
-<w:document xmlns:wpc="http://schemas.microsoft.com/office/word/2010/wordprocessingCanvas" xmlns:cx="http://schemas.microsoft.com/office/drawing/2014/chartex" xmlns:cx1="http://schemas.microsoft.com/office/drawing/2015/9/8/chartex" xmlns:cx2="http://schemas.microsoft.com/office/drawing/2015/10/21/chartex" xmlns:cx3="http://schemas.microsoft.com/office/drawing/2016/5/9/chartex" xmlns:cx4="http://schemas.microsoft.com/office/drawing/2016/5/10/chartex" xmlns:cx5="http://schemas.microsoft.com/office/drawing/2016/5/11/chartex" xmlns:cx6="http://schemas.microsoft.com/office/drawing/2016/5/12/chartex" xmlns:cx7="http://schemas.microsoft.com/office/drawing/2016/5/13/chartex" xmlns:cx8="http://schemas.microsoft.com/office/drawing/2016/5/14/chartex" xmlns:mc="http://schemas.openxmlformats.org/markup-compatibility/2006" xmlns:aink="http://schemas.microsoft.com/office/drawing/2016/ink" xmlns:am3d="http://schemas.microsoft.com/office/drawing/2017/model3d" xmlns:o="urn:schemas-microsoft-com:office:office" xmlns:oel="http://schemas.microsoft.com/office/2019/extlst" xmlns:r="http://schemas.openxmlformats.org/officeDocument/2006/relationships" xmlns:m="http://schemas.openxmlformats.org/officeDocument/2006/math" xmlns:v="urn:schemas-microsoft-com:vml" xmlns:wp14="http://schemas.microsoft.com/office/word/2010/wordprocessingDrawing" xmlns:wp="http://schemas.openxmlformats.org/drawingml/2006/wordprocessingDrawing" xmlns:w10="urn:schemas-microsoft-com:office:word" xmlns:w="http://schemas.openxmlformats.org/wordprocessingml/2006/main" xmlns:w14="http://schemas.microsoft.com/office/word/2010/wordml" xmlns:w15="http://schemas.microsoft.com/office/word/2012/wordml" xmlns:w16cei="http://schemas.microsoft.com/office/word/2026/wordml/cei" xmlns:w16cex="http://schemas.microsoft.com/office/word/2018/wordml/cex" xmlns:w16cid="http://schemas.microsoft.com/office/word/2016/wordml/cid" xmlns:w16="http://schemas.microsoft.com/office/word/2018/wordml" xmlns:w16du="http://schemas.microsoft.com/office/word/2023/wordml/word16du" xmlns:w16sdtdh="http://schemas.microsoft.com/office/word/2020/wordml/sdtdatahash" xmlns:w16sdtfl="http://schemas.microsoft.com/office/word/2024/wordml/sdtformatlock" xmlns:w16se="http://schemas.microsoft.com/office/word/2015/wordml/symex" xmlns:wpg="http://schemas.microsoft.com/office/word/2010/wordprocessingGroup" xmlns:wpi="http://schemas.microsoft.com/office/word/2010/wordprocessingInk" xmlns:wne="http://schemas.microsoft.com/office/word/2006/wordml" xmlns:wps="http://schemas.microsoft.com/office/word/2010/wordprocessingShape" mc:Ignorable="w14 w15 w16se w16cid w16 w16cex w16sdtdh w16sdtfl w16du wp14">
+<w:document xmlns:wpc="http://schemas.microsoft.com/office/word/2010/wordprocessingCanvas" xmlns:cx="http://schemas.microsoft.com/office/drawing/2014/chartex" xmlns:cx1="http://schemas.microsoft.com/office/drawing/2015/9/8/chartex" xmlns:cx2="http://schemas.microsoft.com/office/drawing/2015/10/21/chartex" xmlns:cx3="http://schemas.microsoft.com/office/drawing/2016/5/9/chartex" xmlns:cx4="http://schemas.microsoft.com/office/drawing/2016/5/10/chartex" xmlns:cx5="http://schemas.microsoft.com/office/drawing/2016/5/11/chartex" xmlns:cx6="http://schemas.microsoft.com/office/drawing/2016/5/12/chartex" xmlns:cx7="http://schemas.microsoft.com/office/drawing/2016/5/13/chartex" xmlns:cx8="http://schemas.microsoft.com/office/drawing/2016/5/14/chartex" xmlns:mc="http://schemas.openxmlformats.org/markup-compatibility/2006" xmlns:aink="http://schemas.microsoft.com/office/drawing/2016/ink" xmlns:am3d="http://schemas.microsoft.com/office/drawing/2017/model3d" xmlns:o="urn:schemas-microsoft-com:office:office" xmlns:oel="http://schemas.microsoft.com/office/2019/extlst" xmlns:r="http://schemas.openxmlformats.org/officeDocument/2006/relationships" xmlns:m="http://schemas.openxmlformats.org/officeDocument/2006/math" xmlns:v="urn:schemas-microsoft-com:vml" xmlns:wp14="http://schemas.microsoft.com/office/word/2010/wordprocessingDrawing" xmlns:wp="http://schemas.openxmlformats.org/drawingml/2006/wordprocessingDrawing" xmlns:w10="urn:schemas-microsoft-com:office:word" xmlns:w="http://schemas.openxmlformats.org/wordprocessingml/2006/main" xmlns:w14="http://schemas.microsoft.com/office/word/2010/wordml" xmlns:w15="http://schemas.microsoft.com/office/word/2012/wordml" xmlns:w16cex="http://schemas.microsoft.com/office/word/2018/wordml/cex" xmlns:w16cid="http://schemas.microsoft.com/office/word/2016/wordml/cid" xmlns:w16="http://schemas.microsoft.com/office/word/2018/wordml" xmlns:w16du="http://schemas.microsoft.com/office/word/2023/wordml/word16du" xmlns:w16sdtdh="http://schemas.microsoft.com/office/word/2020/wordml/sdtdatahash" xmlns:w16sdtfl="http://schemas.microsoft.com/office/word/2024/wordml/sdtformatlock" xmlns:w16se="http://schemas.microsoft.com/office/word/2015/wordml/symex" xmlns:wpg="http://schemas.microsoft.com/office/word/2010/wordprocessingGroup" xmlns:wpi="http://schemas.microsoft.com/office/word/2010/wordprocessingInk" xmlns:wne="http://schemas.microsoft.com/office/word/2006/wordml" xmlns:wps="http://schemas.microsoft.com/office/word/2010/wordprocessingShape" mc:Ignorable="w14 w15 w16se w16cid w16 w16cex w16sdtdh w16sdtfl w16du wp14">
   <w:body>
     <w:p>
       <w:r>
@@ -29,26 +29,17 @@
     </w:p>
     <w:p>
       <w:r>
-        <w:t>ESA/ADMIN/IPOL-</w:t>
+        <w:t>ESA/ADMIN/IPOL-WORK(2023)1 Att.: Annex Paris, 1st February 2023 (Original: English) Distribution: all staff ESA unclassified – “Releasable to the Public” Policy on Reporting Unwanted Conduct and Investigating Harassment at ESA</w:t>
       </w:r>
-      <w:proofErr w:type="gramStart"/>
+    </w:p>
+    <w:p>
       <w:r>
-        <w:t>WORK(</w:t>
-      </w:r>
-      <w:proofErr w:type="gramEnd"/>
-      <w:r>
-        <w:t>2023)1 Att.: Annex Paris, 1st February 2023 (Original: English) Distribution: all staff ESA unclassified – “Releasable to the Public” Policy on Reporting Unwanted Conduct and Investigating Harassment at ESA</w:t>
+        <w:t>TECHNOLOGY 2040: A VISION FOR THE EUROPEAN SPACE AGENCY</w:t>
       </w:r>
     </w:p>
     <w:p/>
     <w:p/>
-    <w:p>
-      <w:pPr>
-        <w:rPr>
-          <w:lang w:val="it-IT"/>
-        </w:rPr>
-      </w:pPr>
-    </w:p>
+    <w:p/>
     <w:sectPr>
       <w:pgSz w:w="11906" w:h="16838"/>
       <w:pgMar w:top="1440" w:right="1440" w:bottom="1440" w:left="1440" w:header="720" w:footer="720" w:gutter="0"/>
@@ -662,7 +653,6 @@
   <w:style w:type="character" w:default="1" w:styleId="DefaultParagraphFont">
     <w:name w:val="Default Paragraph Font"/>
     <w:uiPriority w:val="1"/>
-    <w:semiHidden/>
     <w:unhideWhenUsed/>
   </w:style>
   <w:style w:type="table" w:default="1" w:styleId="TableNormal">

</xml_diff>